<commit_message>
Clean up archive, add 500 respondent study results
- Remove old archive files (experiments, presentation materials, docs)
- Add synthetic data outputs for multiple studies (61405445-01, 61407017, 61407069, 61407185, 61407240)
- Add 500 respondent study for 61407240 UK (comparison with 200 resp)
- Add concept.json files for UK markets
- Add new reports (SAGE_Presentation.pptx, SAGE_Technical_Report.docx)
- Update README, .gitignore, and report generation scripts

Co-Authored-By: Claude Opus 4.5 <noreply@anthropic.com>
</commit_message>
<xml_diff>
--- a/reports/Synthetic_Survey_Generation_Report.docx
+++ b/reports/Synthetic_Survey_Generation_Report.docx
@@ -4519,6 +4519,11 @@
     <w:p>
       <w:pPr>
         <w:pStyle w:val="ListNumber"/>
+        <w:numPr>
+          <w:ilvl w:val="0"/>
+          <w:numId w:val="0"/>
+        </w:numPr>
+        <w:ind w:left="360" w:hanging="360"/>
         <w:rPr>
           <w:rFonts w:asciiTheme="majorHAnsi" w:hAnsiTheme="majorHAnsi" w:cstheme="majorHAnsi"/>
         </w:rPr>
@@ -4533,6 +4538,11 @@
     <w:p>
       <w:pPr>
         <w:pStyle w:val="ListNumber"/>
+        <w:numPr>
+          <w:ilvl w:val="0"/>
+          <w:numId w:val="0"/>
+        </w:numPr>
+        <w:ind w:left="360" w:hanging="360"/>
         <w:rPr>
           <w:rFonts w:asciiTheme="majorHAnsi" w:hAnsiTheme="majorHAnsi" w:cstheme="majorHAnsi"/>
         </w:rPr>
@@ -4547,6 +4557,11 @@
     <w:p>
       <w:pPr>
         <w:pStyle w:val="ListNumber"/>
+        <w:numPr>
+          <w:ilvl w:val="0"/>
+          <w:numId w:val="0"/>
+        </w:numPr>
+        <w:ind w:left="360" w:hanging="360"/>
         <w:rPr>
           <w:rFonts w:asciiTheme="majorHAnsi" w:hAnsiTheme="majorHAnsi" w:cstheme="majorHAnsi"/>
         </w:rPr>
@@ -4561,6 +4576,11 @@
     <w:p>
       <w:pPr>
         <w:pStyle w:val="ListNumber"/>
+        <w:numPr>
+          <w:ilvl w:val="0"/>
+          <w:numId w:val="0"/>
+        </w:numPr>
+        <w:ind w:left="360" w:hanging="360"/>
         <w:rPr>
           <w:rFonts w:asciiTheme="majorHAnsi" w:hAnsiTheme="majorHAnsi" w:cstheme="majorHAnsi"/>
         </w:rPr>
@@ -4569,12 +4589,37 @@
         <w:rPr>
           <w:rFonts w:asciiTheme="majorHAnsi" w:hAnsiTheme="majorHAnsi" w:cstheme="majorHAnsi"/>
         </w:rPr>
-        <w:t>4. Probability Distribution: Similarities converted to probability mass function (PMF) via linear normalization</w:t>
+        <w:t xml:space="preserve">4. Probability Distribution: Similarities converted to probability mass function (PMF) via linear </w:t>
       </w:r>
+      <w:proofErr w:type="spellStart"/>
+      <w:r>
+        <w:rPr>
+          <w:rFonts w:asciiTheme="majorHAnsi" w:hAnsiTheme="majorHAnsi" w:cstheme="majorHAnsi"/>
+        </w:rPr>
+        <w:t>normali</w:t>
+      </w:r>
+      <w:r>
+        <w:rPr>
+          <w:rFonts w:asciiTheme="majorHAnsi" w:hAnsiTheme="majorHAnsi" w:cstheme="majorHAnsi"/>
+        </w:rPr>
+        <w:t>s</w:t>
+      </w:r>
+      <w:r>
+        <w:rPr>
+          <w:rFonts w:asciiTheme="majorHAnsi" w:hAnsiTheme="majorHAnsi" w:cstheme="majorHAnsi"/>
+        </w:rPr>
+        <w:t>ation</w:t>
+      </w:r>
+      <w:proofErr w:type="spellEnd"/>
     </w:p>
     <w:p>
       <w:pPr>
         <w:pStyle w:val="ListNumber"/>
+        <w:numPr>
+          <w:ilvl w:val="0"/>
+          <w:numId w:val="0"/>
+        </w:numPr>
+        <w:ind w:left="360" w:hanging="360"/>
         <w:rPr>
           <w:rFonts w:asciiTheme="majorHAnsi" w:hAnsiTheme="majorHAnsi" w:cstheme="majorHAnsi"/>
         </w:rPr>
@@ -4589,6 +4634,11 @@
     <w:p>
       <w:pPr>
         <w:pStyle w:val="ListNumber"/>
+        <w:numPr>
+          <w:ilvl w:val="0"/>
+          <w:numId w:val="0"/>
+        </w:numPr>
+        <w:ind w:left="360" w:hanging="360"/>
         <w:rPr>
           <w:rFonts w:asciiTheme="majorHAnsi" w:hAnsiTheme="majorHAnsi" w:cstheme="majorHAnsi"/>
         </w:rPr>
@@ -4603,6 +4653,11 @@
     <w:p>
       <w:pPr>
         <w:pStyle w:val="ListNumber"/>
+        <w:numPr>
+          <w:ilvl w:val="0"/>
+          <w:numId w:val="0"/>
+        </w:numPr>
+        <w:ind w:left="360" w:hanging="360"/>
         <w:rPr>
           <w:rFonts w:asciiTheme="majorHAnsi" w:hAnsiTheme="majorHAnsi" w:cstheme="majorHAnsi"/>
         </w:rPr>
@@ -4616,6 +4671,80 @@
     </w:p>
     <w:p>
       <w:pPr>
+        <w:pStyle w:val="ListNumber"/>
+        <w:numPr>
+          <w:ilvl w:val="0"/>
+          <w:numId w:val="0"/>
+        </w:numPr>
+        <w:ind w:left="360" w:hanging="360"/>
+        <w:rPr>
+          <w:rFonts w:asciiTheme="majorHAnsi" w:hAnsiTheme="majorHAnsi" w:cstheme="majorHAnsi"/>
+        </w:rPr>
+      </w:pPr>
+    </w:p>
+    <w:p>
+      <w:pPr>
+        <w:pStyle w:val="ListNumber"/>
+        <w:numPr>
+          <w:ilvl w:val="0"/>
+          <w:numId w:val="0"/>
+        </w:numPr>
+        <w:ind w:left="360" w:hanging="360"/>
+        <w:rPr>
+          <w:rFonts w:asciiTheme="majorHAnsi" w:hAnsiTheme="majorHAnsi" w:cstheme="majorHAnsi"/>
+        </w:rPr>
+      </w:pPr>
+      <w:r>
+        <w:rPr>
+          <w:rFonts w:asciiTheme="majorHAnsi" w:hAnsiTheme="majorHAnsi" w:cstheme="majorHAnsi"/>
+          <w:noProof/>
+        </w:rPr>
+        <w:lastRenderedPageBreak/>
+        <w:drawing>
+          <wp:inline distT="0" distB="0" distL="0" distR="0" wp14:anchorId="59301D09" wp14:editId="58311A02">
+            <wp:extent cx="4389120" cy="8229600"/>
+            <wp:effectExtent l="0" t="0" r="5080" b="0"/>
+            <wp:docPr id="1118394125" name="Graphic 3"/>
+            <wp:cNvGraphicFramePr>
+              <a:graphicFrameLocks xmlns:a="http://schemas.openxmlformats.org/drawingml/2006/main" noChangeAspect="1"/>
+            </wp:cNvGraphicFramePr>
+            <a:graphic xmlns:a="http://schemas.openxmlformats.org/drawingml/2006/main">
+              <a:graphicData uri="http://schemas.openxmlformats.org/drawingml/2006/picture">
+                <pic:pic xmlns:pic="http://schemas.openxmlformats.org/drawingml/2006/picture">
+                  <pic:nvPicPr>
+                    <pic:cNvPr id="1118394125" name="Graphic 1118394125"/>
+                    <pic:cNvPicPr/>
+                  </pic:nvPicPr>
+                  <pic:blipFill>
+                    <a:blip r:embed="rId6">
+                      <a:extLst>
+                        <a:ext uri="{96DAC541-7B7A-43D3-8B79-37D633B846F1}">
+                          <asvg:svgBlip xmlns:asvg="http://schemas.microsoft.com/office/drawing/2016/SVG/main" r:embed="rId7"/>
+                        </a:ext>
+                      </a:extLst>
+                    </a:blip>
+                    <a:stretch>
+                      <a:fillRect/>
+                    </a:stretch>
+                  </pic:blipFill>
+                  <pic:spPr>
+                    <a:xfrm>
+                      <a:off x="0" y="0"/>
+                      <a:ext cx="4389120" cy="8229600"/>
+                    </a:xfrm>
+                    <a:prstGeom prst="rect">
+                      <a:avLst/>
+                    </a:prstGeom>
+                  </pic:spPr>
+                </pic:pic>
+              </a:graphicData>
+            </a:graphic>
+          </wp:inline>
+        </w:drawing>
+      </w:r>
+    </w:p>
+    <w:p>
+      <w:pPr>
         <w:pStyle w:val="Heading3"/>
         <w:rPr>
           <w:rFonts w:cstheme="majorHAnsi"/>
@@ -4626,6 +4755,7 @@
         <w:rPr>
           <w:rFonts w:cstheme="majorHAnsi"/>
         </w:rPr>
+        <w:lastRenderedPageBreak/>
         <w:t>SSR Configuration Parameters</w:t>
       </w:r>
       <w:bookmarkEnd w:id="6"/>
@@ -5466,6 +5596,7 @@
         <w:rPr>
           <w:rFonts w:asciiTheme="majorHAnsi" w:hAnsiTheme="majorHAnsi" w:cstheme="majorHAnsi"/>
         </w:rPr>
+        <w:lastRenderedPageBreak/>
         <w:t>5. Apply same screening rules (exclude marketing/advertising occupations)</w:t>
       </w:r>
     </w:p>
@@ -5536,7 +5667,7 @@
                     <pic:cNvPicPr/>
                   </pic:nvPicPr>
                   <pic:blipFill>
-                    <a:blip r:embed="rId6"/>
+                    <a:blip r:embed="rId8"/>
                     <a:stretch>
                       <a:fillRect/>
                     </a:stretch>
@@ -5620,7 +5751,6 @@
         <w:rPr>
           <w:rFonts w:asciiTheme="majorHAnsi" w:hAnsiTheme="majorHAnsi" w:cstheme="majorHAnsi"/>
         </w:rPr>
-        <w:lastRenderedPageBreak/>
         <w:t>3. Concept Assignment: Randomly assign 3 concepts per respondent (matching Kantar methodology)</w:t>
       </w:r>
     </w:p>
@@ -6131,7 +6261,14 @@
               <w:rPr>
                 <w:rFonts w:asciiTheme="majorHAnsi" w:hAnsiTheme="majorHAnsi" w:cstheme="majorHAnsi"/>
               </w:rPr>
-              <w:t>13 categories (screened)</w:t>
+              <w:t xml:space="preserve">13 categories </w:t>
+            </w:r>
+            <w:r>
+              <w:rPr>
+                <w:rFonts w:asciiTheme="majorHAnsi" w:hAnsiTheme="majorHAnsi" w:cstheme="majorHAnsi"/>
+              </w:rPr>
+              <w:lastRenderedPageBreak/>
+              <w:t>(screened)</w:t>
             </w:r>
           </w:p>
         </w:tc>
@@ -6149,6 +6286,7 @@
               <w:rPr>
                 <w:rFonts w:asciiTheme="majorHAnsi" w:hAnsiTheme="majorHAnsi" w:cstheme="majorHAnsi"/>
               </w:rPr>
+              <w:lastRenderedPageBreak/>
               <w:t>GT distribution</w:t>
             </w:r>
           </w:p>
@@ -6247,7 +6385,21 @@
           <w:rFonts w:asciiTheme="majorHAnsi" w:hAnsiTheme="majorHAnsi" w:cstheme="majorHAnsi"/>
           <w:b/>
         </w:rPr>
-        <w:t>Occupation Screening (Excluded):</w:t>
+        <w:t>Occupation Screening (</w:t>
+      </w:r>
+      <w:r>
+        <w:rPr>
+          <w:rFonts w:asciiTheme="majorHAnsi" w:hAnsiTheme="majorHAnsi" w:cstheme="majorHAnsi"/>
+          <w:b/>
+        </w:rPr>
+        <w:t>Personas Excluded</w:t>
+      </w:r>
+      <w:r>
+        <w:rPr>
+          <w:rFonts w:asciiTheme="majorHAnsi" w:hAnsiTheme="majorHAnsi" w:cstheme="majorHAnsi"/>
+          <w:b/>
+        </w:rPr>
+        <w:t>):</w:t>
       </w:r>
     </w:p>
     <w:p>
@@ -6642,7 +6794,6 @@
         <w:rPr>
           <w:rFonts w:cstheme="majorHAnsi"/>
         </w:rPr>
-        <w:lastRenderedPageBreak/>
         <w:t>2.2 Prompt Configuration</w:t>
       </w:r>
       <w:bookmarkEnd w:id="14"/>
@@ -6771,9 +6922,11 @@
     </w:p>
     <w:p>
       <w:pPr>
-        <w:pStyle w:val="Heading3"/>
-        <w:rPr>
-          <w:rFonts w:cstheme="majorHAnsi"/>
+        <w:rPr>
+          <w:rFonts w:asciiTheme="majorHAnsi" w:eastAsiaTheme="majorEastAsia" w:hAnsiTheme="majorHAnsi" w:cstheme="majorHAnsi"/>
+          <w:b/>
+          <w:bCs/>
+          <w:color w:val="4F81BD" w:themeColor="accent1"/>
         </w:rPr>
       </w:pPr>
       <w:bookmarkStart w:id="16" w:name="_Toc219469644"/>
@@ -6781,6 +6934,21 @@
         <w:rPr>
           <w:rFonts w:cstheme="majorHAnsi"/>
         </w:rPr>
+        <w:br w:type="page"/>
+      </w:r>
+    </w:p>
+    <w:p>
+      <w:pPr>
+        <w:pStyle w:val="Heading3"/>
+        <w:rPr>
+          <w:rFonts w:cstheme="majorHAnsi"/>
+        </w:rPr>
+      </w:pPr>
+      <w:r>
+        <w:rPr>
+          <w:rFonts w:cstheme="majorHAnsi"/>
+        </w:rPr>
+        <w:lastRenderedPageBreak/>
         <w:t>Question-Specific Prompts</w:t>
       </w:r>
       <w:bookmarkEnd w:id="16"/>
@@ -7186,10 +7354,216 @@
     </w:tbl>
     <w:p>
       <w:pPr>
-        <w:rPr>
-          <w:rFonts w:asciiTheme="majorHAnsi" w:hAnsiTheme="majorHAnsi" w:cstheme="majorHAnsi"/>
-        </w:rPr>
-      </w:pPr>
+        <w:pStyle w:val="Heading1"/>
+        <w:rPr>
+          <w:color w:val="4F81BD" w:themeColor="accent1"/>
+          <w:sz w:val="26"/>
+          <w:szCs w:val="26"/>
+        </w:rPr>
+      </w:pPr>
+      <w:bookmarkStart w:id="17" w:name="_Toc219469645"/>
+      <w:r>
+        <w:t>2.3 Anchor Text Configuration</w:t>
+      </w:r>
+      <w:bookmarkEnd w:id="17"/>
+      <w:r>
+        <w:br/>
+      </w:r>
+    </w:p>
+    <w:p>
+      <w:pPr>
+        <w:rPr>
+          <w:rFonts w:asciiTheme="majorHAnsi" w:hAnsiTheme="majorHAnsi" w:cstheme="majorHAnsi"/>
+        </w:rPr>
+      </w:pPr>
+      <w:r>
+        <w:rPr>
+          <w:rFonts w:asciiTheme="majorHAnsi" w:hAnsiTheme="majorHAnsi" w:cstheme="majorHAnsi"/>
+        </w:rPr>
+        <w:t>Each scale uses 6 reference sets of anchor texts to improve robustness. Example for Purchase Intent (5-point scale):</w:t>
+      </w:r>
+    </w:p>
+    <w:p>
+      <w:pPr>
+        <w:rPr>
+          <w:rFonts w:asciiTheme="majorHAnsi" w:hAnsiTheme="majorHAnsi" w:cstheme="majorHAnsi"/>
+        </w:rPr>
+      </w:pPr>
+      <w:r>
+        <w:rPr>
+          <w:rFonts w:asciiTheme="majorHAnsi" w:hAnsiTheme="majorHAnsi" w:cstheme="majorHAnsi"/>
+          <w:b/>
+        </w:rPr>
+        <w:t>Primary Anchors:</w:t>
+      </w:r>
+    </w:p>
+    <w:p>
+      <w:pPr>
+        <w:pStyle w:val="ListBullet"/>
+        <w:rPr>
+          <w:rFonts w:asciiTheme="majorHAnsi" w:hAnsiTheme="majorHAnsi" w:cstheme="majorHAnsi"/>
+        </w:rPr>
+      </w:pPr>
+      <w:r>
+        <w:rPr>
+          <w:rFonts w:asciiTheme="majorHAnsi" w:hAnsiTheme="majorHAnsi" w:cstheme="majorHAnsi"/>
+        </w:rPr>
+        <w:t>1. "I would definitely not buy this scratchcard..."</w:t>
+      </w:r>
+    </w:p>
+    <w:p>
+      <w:pPr>
+        <w:pStyle w:val="ListBullet"/>
+        <w:rPr>
+          <w:rFonts w:asciiTheme="majorHAnsi" w:hAnsiTheme="majorHAnsi" w:cstheme="majorHAnsi"/>
+        </w:rPr>
+      </w:pPr>
+      <w:r>
+        <w:rPr>
+          <w:rFonts w:asciiTheme="majorHAnsi" w:hAnsiTheme="majorHAnsi" w:cstheme="majorHAnsi"/>
+        </w:rPr>
+        <w:t>2. "I probably would not buy this scratchcard..."</w:t>
+      </w:r>
+    </w:p>
+    <w:p>
+      <w:pPr>
+        <w:pStyle w:val="ListBullet"/>
+        <w:rPr>
+          <w:rFonts w:asciiTheme="majorHAnsi" w:hAnsiTheme="majorHAnsi" w:cstheme="majorHAnsi"/>
+        </w:rPr>
+      </w:pPr>
+      <w:r>
+        <w:rPr>
+          <w:rFonts w:asciiTheme="majorHAnsi" w:hAnsiTheme="majorHAnsi" w:cstheme="majorHAnsi"/>
+        </w:rPr>
+        <w:t>3. "I might or might not buy this scratchcard..."</w:t>
+      </w:r>
+    </w:p>
+    <w:p>
+      <w:pPr>
+        <w:pStyle w:val="ListBullet"/>
+        <w:rPr>
+          <w:rFonts w:asciiTheme="majorHAnsi" w:hAnsiTheme="majorHAnsi" w:cstheme="majorHAnsi"/>
+        </w:rPr>
+      </w:pPr>
+      <w:r>
+        <w:rPr>
+          <w:rFonts w:asciiTheme="majorHAnsi" w:hAnsiTheme="majorHAnsi" w:cstheme="majorHAnsi"/>
+        </w:rPr>
+        <w:t>4. "I would probably buy this scratchcard..."</w:t>
+      </w:r>
+    </w:p>
+    <w:p>
+      <w:pPr>
+        <w:pStyle w:val="ListBullet"/>
+        <w:rPr>
+          <w:rFonts w:asciiTheme="majorHAnsi" w:hAnsiTheme="majorHAnsi" w:cstheme="majorHAnsi"/>
+        </w:rPr>
+      </w:pPr>
+      <w:r>
+        <w:rPr>
+          <w:rFonts w:asciiTheme="majorHAnsi" w:hAnsiTheme="majorHAnsi" w:cstheme="majorHAnsi"/>
+        </w:rPr>
+        <w:t>5. "I would absolutely buy this scratchcard! No question..."</w:t>
+      </w:r>
+    </w:p>
+    <w:p>
+      <w:pPr>
+        <w:rPr>
+          <w:rFonts w:asciiTheme="majorHAnsi" w:hAnsiTheme="majorHAnsi" w:cstheme="majorHAnsi"/>
+        </w:rPr>
+      </w:pPr>
+      <w:r>
+        <w:rPr>
+          <w:rFonts w:asciiTheme="majorHAnsi" w:hAnsiTheme="majorHAnsi" w:cstheme="majorHAnsi"/>
+          <w:b/>
+        </w:rPr>
+        <w:t>Reference Set Variations:</w:t>
+      </w:r>
+    </w:p>
+    <w:p>
+      <w:pPr>
+        <w:pStyle w:val="ListBullet"/>
+        <w:rPr>
+          <w:rFonts w:asciiTheme="majorHAnsi" w:hAnsiTheme="majorHAnsi" w:cstheme="majorHAnsi"/>
+        </w:rPr>
+      </w:pPr>
+      <w:r>
+        <w:rPr>
+          <w:rFonts w:asciiTheme="majorHAnsi" w:hAnsiTheme="majorHAnsi" w:cstheme="majorHAnsi"/>
+        </w:rPr>
+        <w:t>Set 0: Direct purchase intention framing</w:t>
+      </w:r>
+    </w:p>
+    <w:p>
+      <w:pPr>
+        <w:pStyle w:val="ListBullet"/>
+        <w:rPr>
+          <w:rFonts w:asciiTheme="majorHAnsi" w:hAnsiTheme="majorHAnsi" w:cstheme="majorHAnsi"/>
+        </w:rPr>
+      </w:pPr>
+      <w:r>
+        <w:rPr>
+          <w:rFonts w:asciiTheme="majorHAnsi" w:hAnsiTheme="majorHAnsi" w:cstheme="majorHAnsi"/>
+        </w:rPr>
+        <w:t>Set 1: Formal purchase intent framing</w:t>
+      </w:r>
+    </w:p>
+    <w:p>
+      <w:pPr>
+        <w:pStyle w:val="ListBullet"/>
+        <w:rPr>
+          <w:rFonts w:asciiTheme="majorHAnsi" w:hAnsiTheme="majorHAnsi" w:cstheme="majorHAnsi"/>
+        </w:rPr>
+      </w:pPr>
+      <w:r>
+        <w:rPr>
+          <w:rFonts w:asciiTheme="majorHAnsi" w:hAnsiTheme="majorHAnsi" w:cstheme="majorHAnsi"/>
+        </w:rPr>
+        <w:t>Set 2: Casual purchase expression</w:t>
+      </w:r>
+    </w:p>
+    <w:p>
+      <w:pPr>
+        <w:pStyle w:val="ListBullet"/>
+        <w:rPr>
+          <w:rFonts w:asciiTheme="majorHAnsi" w:hAnsiTheme="majorHAnsi" w:cstheme="majorHAnsi"/>
+        </w:rPr>
+      </w:pPr>
+      <w:r>
+        <w:rPr>
+          <w:rFonts w:asciiTheme="majorHAnsi" w:hAnsiTheme="majorHAnsi" w:cstheme="majorHAnsi"/>
+        </w:rPr>
+        <w:t>Set 3: Interest-based framing</w:t>
+      </w:r>
+    </w:p>
+    <w:p>
+      <w:pPr>
+        <w:pStyle w:val="ListBullet"/>
+        <w:rPr>
+          <w:rFonts w:asciiTheme="majorHAnsi" w:hAnsiTheme="majorHAnsi" w:cstheme="majorHAnsi"/>
+        </w:rPr>
+      </w:pPr>
+      <w:r>
+        <w:rPr>
+          <w:rFonts w:asciiTheme="majorHAnsi" w:hAnsiTheme="majorHAnsi" w:cstheme="majorHAnsi"/>
+        </w:rPr>
+        <w:t>Set 4: Action-oriented framing</w:t>
+      </w:r>
+    </w:p>
+    <w:p>
+      <w:pPr>
+        <w:pStyle w:val="ListBullet"/>
+        <w:rPr>
+          <w:rFonts w:asciiTheme="majorHAnsi" w:hAnsiTheme="majorHAnsi" w:cstheme="majorHAnsi"/>
+        </w:rPr>
+      </w:pPr>
+      <w:r>
+        <w:rPr>
+          <w:rFonts w:asciiTheme="majorHAnsi" w:hAnsiTheme="majorHAnsi" w:cstheme="majorHAnsi"/>
+        </w:rPr>
+        <w:t>Set 5: Likelihood-based framing</w:t>
+      </w:r>
     </w:p>
     <w:p>
       <w:pPr>
@@ -7197,22 +7571,22 @@
           <w:rFonts w:asciiTheme="majorHAnsi" w:eastAsiaTheme="majorEastAsia" w:hAnsiTheme="majorHAnsi" w:cstheme="majorHAnsi"/>
           <w:b/>
           <w:bCs/>
-          <w:color w:val="4F81BD" w:themeColor="accent1"/>
-          <w:sz w:val="26"/>
-          <w:szCs w:val="26"/>
-        </w:rPr>
-      </w:pPr>
-      <w:bookmarkStart w:id="17" w:name="_Toc219469645"/>
+          <w:color w:val="365F91" w:themeColor="accent1" w:themeShade="BF"/>
+          <w:sz w:val="28"/>
+          <w:szCs w:val="28"/>
+        </w:rPr>
+      </w:pPr>
+      <w:bookmarkStart w:id="18" w:name="_Toc219469646"/>
       <w:r>
         <w:rPr>
-          <w:rFonts w:asciiTheme="majorHAnsi" w:hAnsiTheme="majorHAnsi" w:cstheme="majorHAnsi"/>
+          <w:rFonts w:cstheme="majorHAnsi"/>
         </w:rPr>
         <w:br w:type="page"/>
       </w:r>
     </w:p>
     <w:p>
       <w:pPr>
-        <w:pStyle w:val="Heading2"/>
+        <w:pStyle w:val="Heading1"/>
         <w:rPr>
           <w:rFonts w:cstheme="majorHAnsi"/>
         </w:rPr>
@@ -7222,223 +7596,6 @@
           <w:rFonts w:cstheme="majorHAnsi"/>
         </w:rPr>
         <w:lastRenderedPageBreak/>
-        <w:t>2.3 Anchor Text Configuration</w:t>
-      </w:r>
-      <w:bookmarkEnd w:id="17"/>
-      <w:r>
-        <w:rPr>
-          <w:rFonts w:cstheme="majorHAnsi"/>
-        </w:rPr>
-        <w:br/>
-      </w:r>
-    </w:p>
-    <w:p>
-      <w:pPr>
-        <w:rPr>
-          <w:rFonts w:asciiTheme="majorHAnsi" w:hAnsiTheme="majorHAnsi" w:cstheme="majorHAnsi"/>
-        </w:rPr>
-      </w:pPr>
-      <w:r>
-        <w:rPr>
-          <w:rFonts w:asciiTheme="majorHAnsi" w:hAnsiTheme="majorHAnsi" w:cstheme="majorHAnsi"/>
-        </w:rPr>
-        <w:t>Each scale uses 6 reference sets of anchor texts to improve robustness. Example for Purchase Intent (5-point scale):</w:t>
-      </w:r>
-    </w:p>
-    <w:p>
-      <w:pPr>
-        <w:rPr>
-          <w:rFonts w:asciiTheme="majorHAnsi" w:hAnsiTheme="majorHAnsi" w:cstheme="majorHAnsi"/>
-        </w:rPr>
-      </w:pPr>
-      <w:r>
-        <w:rPr>
-          <w:rFonts w:asciiTheme="majorHAnsi" w:hAnsiTheme="majorHAnsi" w:cstheme="majorHAnsi"/>
-          <w:b/>
-        </w:rPr>
-        <w:t>Primary Anchors:</w:t>
-      </w:r>
-    </w:p>
-    <w:p>
-      <w:pPr>
-        <w:pStyle w:val="ListBullet"/>
-        <w:rPr>
-          <w:rFonts w:asciiTheme="majorHAnsi" w:hAnsiTheme="majorHAnsi" w:cstheme="majorHAnsi"/>
-        </w:rPr>
-      </w:pPr>
-      <w:r>
-        <w:rPr>
-          <w:rFonts w:asciiTheme="majorHAnsi" w:hAnsiTheme="majorHAnsi" w:cstheme="majorHAnsi"/>
-        </w:rPr>
-        <w:t>1. "I would definitely not buy this scratchcard..."</w:t>
-      </w:r>
-    </w:p>
-    <w:p>
-      <w:pPr>
-        <w:pStyle w:val="ListBullet"/>
-        <w:rPr>
-          <w:rFonts w:asciiTheme="majorHAnsi" w:hAnsiTheme="majorHAnsi" w:cstheme="majorHAnsi"/>
-        </w:rPr>
-      </w:pPr>
-      <w:r>
-        <w:rPr>
-          <w:rFonts w:asciiTheme="majorHAnsi" w:hAnsiTheme="majorHAnsi" w:cstheme="majorHAnsi"/>
-        </w:rPr>
-        <w:t>2. "I probably would not buy this scratchcard..."</w:t>
-      </w:r>
-    </w:p>
-    <w:p>
-      <w:pPr>
-        <w:pStyle w:val="ListBullet"/>
-        <w:rPr>
-          <w:rFonts w:asciiTheme="majorHAnsi" w:hAnsiTheme="majorHAnsi" w:cstheme="majorHAnsi"/>
-        </w:rPr>
-      </w:pPr>
-      <w:r>
-        <w:rPr>
-          <w:rFonts w:asciiTheme="majorHAnsi" w:hAnsiTheme="majorHAnsi" w:cstheme="majorHAnsi"/>
-        </w:rPr>
-        <w:t>3. "I might or might not buy this scratchcard..."</w:t>
-      </w:r>
-    </w:p>
-    <w:p>
-      <w:pPr>
-        <w:pStyle w:val="ListBullet"/>
-        <w:rPr>
-          <w:rFonts w:asciiTheme="majorHAnsi" w:hAnsiTheme="majorHAnsi" w:cstheme="majorHAnsi"/>
-        </w:rPr>
-      </w:pPr>
-      <w:r>
-        <w:rPr>
-          <w:rFonts w:asciiTheme="majorHAnsi" w:hAnsiTheme="majorHAnsi" w:cstheme="majorHAnsi"/>
-        </w:rPr>
-        <w:t>4. "I would probably buy this scratchcard..."</w:t>
-      </w:r>
-    </w:p>
-    <w:p>
-      <w:pPr>
-        <w:pStyle w:val="ListBullet"/>
-        <w:rPr>
-          <w:rFonts w:asciiTheme="majorHAnsi" w:hAnsiTheme="majorHAnsi" w:cstheme="majorHAnsi"/>
-        </w:rPr>
-      </w:pPr>
-      <w:r>
-        <w:rPr>
-          <w:rFonts w:asciiTheme="majorHAnsi" w:hAnsiTheme="majorHAnsi" w:cstheme="majorHAnsi"/>
-        </w:rPr>
-        <w:t>5. "I would absolutely buy this scratchcard! No question..."</w:t>
-      </w:r>
-    </w:p>
-    <w:p>
-      <w:pPr>
-        <w:rPr>
-          <w:rFonts w:asciiTheme="majorHAnsi" w:hAnsiTheme="majorHAnsi" w:cstheme="majorHAnsi"/>
-        </w:rPr>
-      </w:pPr>
-      <w:r>
-        <w:rPr>
-          <w:rFonts w:asciiTheme="majorHAnsi" w:hAnsiTheme="majorHAnsi" w:cstheme="majorHAnsi"/>
-          <w:b/>
-        </w:rPr>
-        <w:t>Reference Set Variations:</w:t>
-      </w:r>
-    </w:p>
-    <w:p>
-      <w:pPr>
-        <w:pStyle w:val="ListBullet"/>
-        <w:rPr>
-          <w:rFonts w:asciiTheme="majorHAnsi" w:hAnsiTheme="majorHAnsi" w:cstheme="majorHAnsi"/>
-        </w:rPr>
-      </w:pPr>
-      <w:r>
-        <w:rPr>
-          <w:rFonts w:asciiTheme="majorHAnsi" w:hAnsiTheme="majorHAnsi" w:cstheme="majorHAnsi"/>
-        </w:rPr>
-        <w:t>Set 0: Direct purchase intention framing</w:t>
-      </w:r>
-    </w:p>
-    <w:p>
-      <w:pPr>
-        <w:pStyle w:val="ListBullet"/>
-        <w:rPr>
-          <w:rFonts w:asciiTheme="majorHAnsi" w:hAnsiTheme="majorHAnsi" w:cstheme="majorHAnsi"/>
-        </w:rPr>
-      </w:pPr>
-      <w:r>
-        <w:rPr>
-          <w:rFonts w:asciiTheme="majorHAnsi" w:hAnsiTheme="majorHAnsi" w:cstheme="majorHAnsi"/>
-        </w:rPr>
-        <w:t>Set 1: Formal purchase intent framing</w:t>
-      </w:r>
-    </w:p>
-    <w:p>
-      <w:pPr>
-        <w:pStyle w:val="ListBullet"/>
-        <w:rPr>
-          <w:rFonts w:asciiTheme="majorHAnsi" w:hAnsiTheme="majorHAnsi" w:cstheme="majorHAnsi"/>
-        </w:rPr>
-      </w:pPr>
-      <w:r>
-        <w:rPr>
-          <w:rFonts w:asciiTheme="majorHAnsi" w:hAnsiTheme="majorHAnsi" w:cstheme="majorHAnsi"/>
-        </w:rPr>
-        <w:t>Set 2: Casual purchase expression</w:t>
-      </w:r>
-    </w:p>
-    <w:p>
-      <w:pPr>
-        <w:pStyle w:val="ListBullet"/>
-        <w:rPr>
-          <w:rFonts w:asciiTheme="majorHAnsi" w:hAnsiTheme="majorHAnsi" w:cstheme="majorHAnsi"/>
-        </w:rPr>
-      </w:pPr>
-      <w:r>
-        <w:rPr>
-          <w:rFonts w:asciiTheme="majorHAnsi" w:hAnsiTheme="majorHAnsi" w:cstheme="majorHAnsi"/>
-        </w:rPr>
-        <w:t>Set 3: Interest-based framing</w:t>
-      </w:r>
-    </w:p>
-    <w:p>
-      <w:pPr>
-        <w:pStyle w:val="ListBullet"/>
-        <w:rPr>
-          <w:rFonts w:asciiTheme="majorHAnsi" w:hAnsiTheme="majorHAnsi" w:cstheme="majorHAnsi"/>
-        </w:rPr>
-      </w:pPr>
-      <w:r>
-        <w:rPr>
-          <w:rFonts w:asciiTheme="majorHAnsi" w:hAnsiTheme="majorHAnsi" w:cstheme="majorHAnsi"/>
-        </w:rPr>
-        <w:t>Set 4: Action-oriented framing</w:t>
-      </w:r>
-    </w:p>
-    <w:p>
-      <w:pPr>
-        <w:pStyle w:val="ListBullet"/>
-        <w:rPr>
-          <w:rFonts w:asciiTheme="majorHAnsi" w:hAnsiTheme="majorHAnsi" w:cstheme="majorHAnsi"/>
-        </w:rPr>
-      </w:pPr>
-      <w:r>
-        <w:rPr>
-          <w:rFonts w:asciiTheme="majorHAnsi" w:hAnsiTheme="majorHAnsi" w:cstheme="majorHAnsi"/>
-        </w:rPr>
-        <w:t>Set 5: Likelihood-based framing</w:t>
-      </w:r>
-    </w:p>
-    <w:p>
-      <w:pPr>
-        <w:pStyle w:val="Heading1"/>
-        <w:rPr>
-          <w:rFonts w:cstheme="majorHAnsi"/>
-        </w:rPr>
-      </w:pPr>
-      <w:bookmarkStart w:id="18" w:name="_Toc219469646"/>
-      <w:r>
-        <w:rPr>
-          <w:rFonts w:cstheme="majorHAnsi"/>
-        </w:rPr>
         <w:t>3. Experimental Results</w:t>
       </w:r>
       <w:bookmarkEnd w:id="18"/>
@@ -7706,17 +7863,8 @@
     </w:tbl>
     <w:p>
       <w:pPr>
-        <w:rPr>
-          <w:rFonts w:asciiTheme="majorHAnsi" w:hAnsiTheme="majorHAnsi" w:cstheme="majorHAnsi"/>
-        </w:rPr>
-      </w:pPr>
-    </w:p>
-    <w:p>
-      <w:pPr>
-        <w:rPr>
-          <w:rFonts w:asciiTheme="majorHAnsi" w:eastAsiaTheme="majorEastAsia" w:hAnsiTheme="majorHAnsi" w:cstheme="majorHAnsi"/>
-          <w:b/>
-          <w:bCs/>
+        <w:pStyle w:val="Heading1"/>
+        <w:rPr>
           <w:color w:val="4F81BD" w:themeColor="accent1"/>
           <w:sz w:val="26"/>
           <w:szCs w:val="26"/>
@@ -7724,31 +7872,10 @@
       </w:pPr>
       <w:bookmarkStart w:id="20" w:name="_Toc219469648"/>
       <w:r>
-        <w:rPr>
-          <w:rFonts w:asciiTheme="majorHAnsi" w:hAnsiTheme="majorHAnsi" w:cstheme="majorHAnsi"/>
-        </w:rPr>
-        <w:br w:type="page"/>
-      </w:r>
-    </w:p>
-    <w:p>
-      <w:pPr>
-        <w:pStyle w:val="Heading2"/>
-        <w:rPr>
-          <w:rFonts w:cstheme="majorHAnsi"/>
-        </w:rPr>
-      </w:pPr>
-      <w:r>
-        <w:rPr>
-          <w:rFonts w:cstheme="majorHAnsi"/>
-        </w:rPr>
-        <w:lastRenderedPageBreak/>
         <w:t>3.2 Results by Study</w:t>
       </w:r>
       <w:bookmarkEnd w:id="20"/>
       <w:r>
-        <w:rPr>
-          <w:rFonts w:cstheme="majorHAnsi"/>
-        </w:rPr>
         <w:br/>
       </w:r>
     </w:p>
@@ -9026,6 +9153,7 @@
         <w:rPr>
           <w:rFonts w:asciiTheme="majorHAnsi" w:hAnsiTheme="majorHAnsi" w:cstheme="majorHAnsi"/>
         </w:rPr>
+        <w:lastRenderedPageBreak/>
         <w:t>Open-ended questions (LIKES_STD, DISLIKES) - free text responses not suitable for distribution comparison</w:t>
       </w:r>
     </w:p>
@@ -9461,7 +9589,6 @@
           <w:rFonts w:asciiTheme="majorHAnsi" w:hAnsiTheme="majorHAnsi" w:cstheme="majorHAnsi"/>
           <w:b/>
         </w:rPr>
-        <w:lastRenderedPageBreak/>
         <w:t>Needs Improvement</w:t>
       </w:r>
     </w:p>
@@ -10124,7 +10251,19 @@
         <w:rPr>
           <w:rFonts w:asciiTheme="majorHAnsi" w:hAnsiTheme="majorHAnsi" w:cstheme="majorHAnsi"/>
         </w:rPr>
-        <w:t>KS Similarity: 81-92%, KL Divergence: 0.03-0.19. Ideal for early-stage concept screening where the key question is "would consumers buy this?" The system reliably predicts purchase intent distributions, making it suitable for winnowing large concept portfolios before investing in full market research.</w:t>
+        <w:t xml:space="preserve">KS Similarity: 81-92%, KL Divergence: 0.03-0.19. Ideal for early-stage concept screening where the key question is "would consumers buy this?" The system reliably predicts purchase intent distributions, making it suitable for </w:t>
+      </w:r>
+      <w:r>
+        <w:rPr>
+          <w:rFonts w:asciiTheme="majorHAnsi" w:hAnsiTheme="majorHAnsi" w:cstheme="majorHAnsi"/>
+        </w:rPr>
+        <w:t xml:space="preserve">narrowing down </w:t>
+      </w:r>
+      <w:r>
+        <w:rPr>
+          <w:rFonts w:asciiTheme="majorHAnsi" w:hAnsiTheme="majorHAnsi" w:cstheme="majorHAnsi"/>
+        </w:rPr>
+        <w:t>large concept portfolios before investing in full market research.</w:t>
       </w:r>
     </w:p>
     <w:p>
@@ -10464,62 +10603,6 @@
               <w:rPr>
                 <w:rFonts w:asciiTheme="majorHAnsi" w:hAnsiTheme="majorHAnsi" w:cstheme="majorHAnsi"/>
               </w:rPr>
-              <w:t>Ground Truth Demographics</w:t>
-            </w:r>
-          </w:p>
-        </w:tc>
-        <w:tc>
-          <w:tcPr>
-            <w:tcW w:w="2880" w:type="dxa"/>
-          </w:tcPr>
-          <w:p>
-            <w:pPr>
-              <w:rPr>
-                <w:rFonts w:asciiTheme="majorHAnsi" w:hAnsiTheme="majorHAnsi" w:cstheme="majorHAnsi"/>
-              </w:rPr>
-            </w:pPr>
-            <w:r>
-              <w:rPr>
-                <w:rFonts w:asciiTheme="majorHAnsi" w:hAnsiTheme="majorHAnsi" w:cstheme="majorHAnsi"/>
-              </w:rPr>
-              <w:t>High</w:t>
-            </w:r>
-          </w:p>
-        </w:tc>
-        <w:tc>
-          <w:tcPr>
-            <w:tcW w:w="2880" w:type="dxa"/>
-          </w:tcPr>
-          <w:p>
-            <w:pPr>
-              <w:rPr>
-                <w:rFonts w:asciiTheme="majorHAnsi" w:hAnsiTheme="majorHAnsi" w:cstheme="majorHAnsi"/>
-              </w:rPr>
-            </w:pPr>
-            <w:r>
-              <w:rPr>
-                <w:rFonts w:asciiTheme="majorHAnsi" w:hAnsiTheme="majorHAnsi" w:cstheme="majorHAnsi"/>
-              </w:rPr>
-              <w:t>Always sample from GT when available</w:t>
-            </w:r>
-          </w:p>
-        </w:tc>
-      </w:tr>
-      <w:tr>
-        <w:tc>
-          <w:tcPr>
-            <w:tcW w:w="2880" w:type="dxa"/>
-          </w:tcPr>
-          <w:p>
-            <w:pPr>
-              <w:rPr>
-                <w:rFonts w:asciiTheme="majorHAnsi" w:hAnsiTheme="majorHAnsi" w:cstheme="majorHAnsi"/>
-              </w:rPr>
-            </w:pPr>
-            <w:r>
-              <w:rPr>
-                <w:rFonts w:asciiTheme="majorHAnsi" w:hAnsiTheme="majorHAnsi" w:cstheme="majorHAnsi"/>
-              </w:rPr>
               <w:t>Number of Reference Sets</w:t>
             </w:r>
           </w:p>
@@ -10930,62 +11013,6 @@
               <w:rPr>
                 <w:rFonts w:asciiTheme="majorHAnsi" w:hAnsiTheme="majorHAnsi" w:cstheme="majorHAnsi"/>
               </w:rPr>
-              <w:t>Demographic Validation</w:t>
-            </w:r>
-          </w:p>
-        </w:tc>
-        <w:tc>
-          <w:tcPr>
-            <w:tcW w:w="2880" w:type="dxa"/>
-          </w:tcPr>
-          <w:p>
-            <w:pPr>
-              <w:rPr>
-                <w:rFonts w:asciiTheme="majorHAnsi" w:hAnsiTheme="majorHAnsi" w:cstheme="majorHAnsi"/>
-              </w:rPr>
-            </w:pPr>
-            <w:r>
-              <w:rPr>
-                <w:rFonts w:asciiTheme="majorHAnsi" w:hAnsiTheme="majorHAnsi" w:cstheme="majorHAnsi"/>
-              </w:rPr>
-              <w:t>Very High</w:t>
-            </w:r>
-          </w:p>
-        </w:tc>
-        <w:tc>
-          <w:tcPr>
-            <w:tcW w:w="2880" w:type="dxa"/>
-          </w:tcPr>
-          <w:p>
-            <w:pPr>
-              <w:rPr>
-                <w:rFonts w:asciiTheme="majorHAnsi" w:hAnsiTheme="majorHAnsi" w:cstheme="majorHAnsi"/>
-              </w:rPr>
-            </w:pPr>
-            <w:r>
-              <w:rPr>
-                <w:rFonts w:asciiTheme="majorHAnsi" w:hAnsiTheme="majorHAnsi" w:cstheme="majorHAnsi"/>
-              </w:rPr>
-              <w:t>Demographics match excellently</w:t>
-            </w:r>
-          </w:p>
-        </w:tc>
-      </w:tr>
-      <w:tr>
-        <w:tc>
-          <w:tcPr>
-            <w:tcW w:w="2880" w:type="dxa"/>
-          </w:tcPr>
-          <w:p>
-            <w:pPr>
-              <w:rPr>
-                <w:rFonts w:asciiTheme="majorHAnsi" w:hAnsiTheme="majorHAnsi" w:cstheme="majorHAnsi"/>
-              </w:rPr>
-            </w:pPr>
-            <w:r>
-              <w:rPr>
-                <w:rFonts w:asciiTheme="majorHAnsi" w:hAnsiTheme="majorHAnsi" w:cstheme="majorHAnsi"/>
-              </w:rPr>
               <w:t>A/B Concept Comparison</w:t>
             </w:r>
           </w:p>
@@ -11370,6 +11397,11 @@
     <w:p>
       <w:pPr>
         <w:pStyle w:val="ListNumber"/>
+        <w:numPr>
+          <w:ilvl w:val="0"/>
+          <w:numId w:val="0"/>
+        </w:numPr>
+        <w:ind w:left="360" w:hanging="360"/>
         <w:rPr>
           <w:rFonts w:asciiTheme="majorHAnsi" w:hAnsiTheme="majorHAnsi" w:cstheme="majorHAnsi"/>
         </w:rPr>
@@ -11384,6 +11416,11 @@
     <w:p>
       <w:pPr>
         <w:pStyle w:val="ListNumber"/>
+        <w:numPr>
+          <w:ilvl w:val="0"/>
+          <w:numId w:val="0"/>
+        </w:numPr>
+        <w:ind w:left="360" w:hanging="360"/>
         <w:rPr>
           <w:rFonts w:asciiTheme="majorHAnsi" w:hAnsiTheme="majorHAnsi" w:cstheme="majorHAnsi"/>
         </w:rPr>
@@ -11398,6 +11435,11 @@
     <w:p>
       <w:pPr>
         <w:pStyle w:val="ListNumber"/>
+        <w:numPr>
+          <w:ilvl w:val="0"/>
+          <w:numId w:val="0"/>
+        </w:numPr>
+        <w:ind w:left="360" w:hanging="360"/>
         <w:rPr>
           <w:rFonts w:asciiTheme="majorHAnsi" w:hAnsiTheme="majorHAnsi" w:cstheme="majorHAnsi"/>
         </w:rPr>
@@ -11412,6 +11454,11 @@
     <w:p>
       <w:pPr>
         <w:pStyle w:val="ListNumber"/>
+        <w:numPr>
+          <w:ilvl w:val="0"/>
+          <w:numId w:val="0"/>
+        </w:numPr>
+        <w:ind w:left="360" w:hanging="360"/>
         <w:rPr>
           <w:rFonts w:asciiTheme="majorHAnsi" w:hAnsiTheme="majorHAnsi" w:cstheme="majorHAnsi"/>
         </w:rPr>

</xml_diff>